<commit_message>
Add Netlify config, cover page, and team names on deliverables.
Co-authored-by: Cursor <cursoragent@cursor.com>
</commit_message>
<xml_diff>
--- a/livrables/document-explicatif.docx
+++ b/livrables/document-explicatif.docx
@@ -2,9 +2,98 @@
 <file path=word/document.xml><?xml version="1.0" encoding="utf-8"?>
 <w:document xmlns:wpc="http://schemas.microsoft.com/office/word/2010/wordprocessingCanvas" xmlns:mo="http://schemas.microsoft.com/office/mac/office/2008/main" xmlns:mc="http://schemas.openxmlformats.org/markup-compatibility/2006" xmlns:mv="urn:schemas-microsoft-com:mac:vml" xmlns:o="urn:schemas-microsoft-com:office:office" xmlns:r="http://schemas.openxmlformats.org/officeDocument/2006/relationships" xmlns:m="http://schemas.openxmlformats.org/officeDocument/2006/math" xmlns:v="urn:schemas-microsoft-com:vml" xmlns:wp14="http://schemas.microsoft.com/office/word/2010/wordprocessingDrawing" xmlns:wp="http://schemas.openxmlformats.org/drawingml/2006/wordprocessingDrawing" xmlns:w10="urn:schemas-microsoft-com:office:word" xmlns:w="http://schemas.openxmlformats.org/wordprocessingml/2006/main" xmlns:w14="http://schemas.microsoft.com/office/word/2010/wordml" xmlns:wpg="http://schemas.microsoft.com/office/word/2010/wordprocessingGroup" xmlns:wpi="http://schemas.microsoft.com/office/word/2010/wordprocessingInk" xmlns:wne="http://schemas.microsoft.com/office/word/2006/wordml" xmlns:wps="http://schemas.microsoft.com/office/word/2010/wordprocessingShape" mc:Ignorable="w14 wp14">
   <w:body>
+    <w:tbl>
+      <w:tblPr>
+        <w:tblW w:type="auto" w:w="0"/>
+        <w:tblLayout w:type="autofit"/>
+        <w:tblLook w:firstColumn="1" w:firstRow="1" w:lastColumn="0" w:lastRow="0" w:noHBand="0" w:noVBand="1" w:val="04A0"/>
+      </w:tblPr>
+      <w:tblGrid>
+        <w:gridCol w:w="9972"/>
+      </w:tblGrid>
+      <w:tr>
+        <w:tc>
+          <w:tcPr>
+            <w:tcW w:type="dxa" w:w="9972"/>
+            <w:shd w:fill="171310" w:val="clear"/>
+          </w:tcPr>
+          <w:p>
+            <w:pPr>
+              <w:spacing w:before="200" w:after="200"/>
+              <w:jc w:val="center"/>
+            </w:pPr>
+            <w:r>
+              <w:rPr>
+                <w:rFonts w:ascii="Calibri" w:hAnsi="Calibri" w:eastAsia="Calibri"/>
+                <w:b/>
+                <w:i w:val="0"/>
+                <w:color w:val="F1EADC"/>
+                <w:sz w:val="22"/>
+              </w:rPr>
+              <w:t>ESIG TECH ARENA 2026  ·  MINI-CHALLENGE DE PRÉSÉLECTION</w:t>
+            </w:r>
+          </w:p>
+        </w:tc>
+      </w:tr>
+    </w:tbl>
     <w:p>
       <w:pPr>
-        <w:spacing w:after="80" w:before="0" w:line="276" w:lineRule="auto"/>
+        <w:spacing w:after="0" w:before="1440" w:line="276" w:lineRule="auto"/>
+        <w:jc w:val="center"/>
+      </w:pPr>
+    </w:p>
+    <w:p>
+      <w:pPr>
+        <w:spacing w:after="200" w:before="0" w:line="276" w:lineRule="auto"/>
+        <w:jc w:val="center"/>
+      </w:pPr>
+      <w:r>
+        <w:rPr>
+          <w:rFonts w:ascii="Calibri" w:hAnsi="Calibri" w:eastAsia="Calibri"/>
+          <w:b w:val="0"/>
+          <w:i w:val="0"/>
+          <w:color w:val="5E564D"/>
+          <w:sz w:val="28"/>
+        </w:rPr>
+        <w:t>Document explicatif de la solution</w:t>
+      </w:r>
+    </w:p>
+    <w:p>
+      <w:pPr>
+        <w:spacing w:after="280" w:before="0" w:line="276" w:lineRule="auto"/>
+        <w:jc w:val="center"/>
+      </w:pPr>
+      <w:r>
+        <w:rPr>
+          <w:rFonts w:ascii="Georgia" w:hAnsi="Georgia" w:eastAsia="Georgia"/>
+          <w:b/>
+          <w:i w:val="0"/>
+          <w:color w:val="171310"/>
+          <w:sz w:val="112"/>
+        </w:rPr>
+        <w:t>Récup’</w:t>
+      </w:r>
+    </w:p>
+    <w:p>
+      <w:pPr>
+        <w:spacing w:after="720" w:before="0" w:line="276" w:lineRule="auto"/>
+        <w:jc w:val="center"/>
+      </w:pPr>
+      <w:r>
+        <w:rPr>
+          <w:rFonts w:ascii="Calibri" w:hAnsi="Calibri" w:eastAsia="Calibri"/>
+          <w:b w:val="0"/>
+          <w:i w:val="0"/>
+          <w:color w:val="171310"/>
+          <w:sz w:val="32"/>
+        </w:rPr>
+        <w:t>Le tableau du campus pour retrouver ce que tu as perdu, et emprunter ce qu’il te manque.</w:t>
+      </w:r>
+    </w:p>
+    <w:p>
+      <w:pPr>
+        <w:spacing w:after="360" w:before="0" w:line="276" w:lineRule="auto"/>
+        <w:jc w:val="center"/>
       </w:pPr>
       <w:r>
         <w:rPr>
@@ -12,29 +101,15 @@
           <w:b/>
           <w:i w:val="0"/>
           <w:color w:val="C43C28"/>
-          <w:sz w:val="20"/>
+          <w:sz w:val="40"/>
         </w:rPr>
-        <w:t>ESIG TECH ARENA 2026  ·  MINI-CHALLENGE DE PRÉSÉLECTION</w:t>
+        <w:t>EQUIPE_7</w:t>
       </w:r>
     </w:p>
     <w:p>
       <w:pPr>
         <w:spacing w:after="120" w:before="0" w:line="276" w:lineRule="auto"/>
-      </w:pPr>
-      <w:r>
-        <w:rPr>
-          <w:rFonts w:ascii="Georgia" w:hAnsi="Georgia" w:eastAsia="Georgia"/>
-          <w:b/>
-          <w:i w:val="0"/>
-          <w:color w:val="171310"/>
-          <w:sz w:val="72"/>
-        </w:rPr>
-        <w:t>Récup’</w:t>
-      </w:r>
-    </w:p>
-    <w:p>
-      <w:pPr>
-        <w:spacing w:after="120" w:before="0" w:line="276" w:lineRule="auto"/>
+        <w:jc w:val="center"/>
       </w:pPr>
       <w:r>
         <w:rPr>
@@ -44,12 +119,45 @@
           <w:color w:val="171310"/>
           <w:sz w:val="28"/>
         </w:rPr>
-        <w:t>Le tableau du campus pour retrouver ce que tu as perdu, et emprunter ce qu’il te manque.</w:t>
+        <w:t>BAKPASSIM Pouwedeo Light</w:t>
       </w:r>
     </w:p>
     <w:p>
       <w:pPr>
-        <w:spacing w:after="40" w:before="0" w:line="276" w:lineRule="auto"/>
+        <w:spacing w:after="120" w:before="0" w:line="276" w:lineRule="auto"/>
+        <w:jc w:val="center"/>
+      </w:pPr>
+      <w:r>
+        <w:rPr>
+          <w:rFonts w:ascii="Calibri" w:hAnsi="Calibri" w:eastAsia="Calibri"/>
+          <w:b w:val="0"/>
+          <w:i w:val="0"/>
+          <w:color w:val="171310"/>
+          <w:sz w:val="28"/>
+        </w:rPr>
+        <w:t>ABOLO-SEWOVI Ami Raphaëlla</w:t>
+      </w:r>
+    </w:p>
+    <w:p>
+      <w:pPr>
+        <w:spacing w:after="120" w:before="0" w:line="276" w:lineRule="auto"/>
+        <w:jc w:val="center"/>
+      </w:pPr>
+      <w:r>
+        <w:rPr>
+          <w:rFonts w:ascii="Calibri" w:hAnsi="Calibri" w:eastAsia="Calibri"/>
+          <w:b w:val="0"/>
+          <w:i w:val="0"/>
+          <w:color w:val="171310"/>
+          <w:sz w:val="28"/>
+        </w:rPr>
+        <w:t>KOUYAKOUTOULI Godwin Marc</w:t>
+      </w:r>
+    </w:p>
+    <w:p>
+      <w:pPr>
+        <w:spacing w:after="0" w:before="1120" w:line="276" w:lineRule="auto"/>
+        <w:jc w:val="center"/>
       </w:pPr>
       <w:r>
         <w:rPr>
@@ -57,35 +165,56 @@
           <w:b w:val="0"/>
           <w:i w:val="0"/>
           <w:color w:val="5E564D"/>
-          <w:sz w:val="22"/>
+          <w:sz w:val="24"/>
         </w:rPr>
-        <w:t>EQUIPE_7  ·  BAKPASSIM Pouwedeo Light  ·  ABOLO-SEWOVI Ami Raphaëlla  ·  KOUYAKOUTOULI Godwin Marc</w:t>
+        <w:t>18 septembre 2026</w:t>
+      </w:r>
+    </w:p>
+    <w:p>
+      <w:r>
+        <w:br w:type="page"/>
       </w:r>
     </w:p>
     <w:p>
       <w:pPr>
-        <w:spacing w:after="280" w:before="0" w:line="276" w:lineRule="auto"/>
-      </w:pPr>
-      <w:r>
-        <w:rPr>
-          <w:rFonts w:ascii="Calibri" w:hAnsi="Calibri" w:eastAsia="Calibri"/>
-          <w:b w:val="0"/>
-          <w:i w:val="0"/>
-          <w:color w:val="5E564D"/>
-          <w:sz w:val="22"/>
-        </w:rPr>
-        <w:t>Prototype web cliquable  ·  17 septembre 2026</w:t>
-      </w:r>
-    </w:p>
-    <w:p>
-      <w:pPr>
-        <w:spacing w:after="160" w:before="320" w:line="276" w:lineRule="auto"/>
+        <w:spacing w:after="120" w:before="160" w:line="276" w:lineRule="auto"/>
       </w:pPr>
       <w:r>
         <w:rPr>
           <w:rFonts w:ascii="Georgia" w:hAnsi="Georgia" w:eastAsia="Georgia"/>
           <w:b/>
           <w:i w:val="0"/>
+          <w:color w:val="C43C28"/>
+          <w:sz w:val="28"/>
+        </w:rPr>
+        <w:t>Table des matières</w:t>
+      </w:r>
+    </w:p>
+    <w:p>
+      <w:pPr>
+        <w:spacing w:after="240"/>
+      </w:pPr>
+      <w:r>
+        <w:fldChar w:fldCharType="begin"/>
+        <w:instrText xml:space="preserve"> TOC \o "1-2" \h \z \u </w:instrText>
+        <w:fldChar w:fldCharType="separate"/>
+      </w:r>
+      <w:r>
+        <w:t>A. Présentation du problème</w:t>
+      </w:r>
+      <w:r>
+        <w:fldChar w:fldCharType="end"/>
+      </w:r>
+    </w:p>
+    <w:p>
+      <w:pPr>
+        <w:pStyle w:val="Heading1"/>
+        <w:spacing w:before="320" w:after="160"/>
+      </w:pPr>
+      <w:r>
+        <w:rPr>
+          <w:rFonts w:ascii="Georgia" w:hAnsi="Georgia"/>
+          <w:b/>
           <w:color w:val="C43C28"/>
           <w:sz w:val="36"/>
         </w:rPr>
@@ -94,18 +223,23 @@
     </w:p>
     <w:p>
       <w:pPr>
-        <w:spacing w:after="160" w:before="0" w:line="276" w:lineRule="auto"/>
+        <w:pStyle w:val="Heading2"/>
+        <w:spacing w:before="200" w:after="160"/>
       </w:pPr>
       <w:r>
         <w:rPr>
-          <w:rFonts w:ascii="Calibri" w:hAnsi="Calibri" w:eastAsia="Calibri"/>
+          <w:rFonts w:ascii="Georgia" w:hAnsi="Georgia"/>
           <w:b/>
-          <w:i w:val="0"/>
-          <w:color w:val="171310"/>
-          <w:sz w:val="22"/>
+          <w:color w:val="C43C28"/>
+          <w:sz w:val="26"/>
         </w:rPr>
-        <w:t xml:space="preserve">Quel est le problème identifié ? </w:t>
+        <w:t>Quel est le problème identifié ?</w:t>
       </w:r>
+    </w:p>
+    <w:p>
+      <w:pPr>
+        <w:spacing w:after="160" w:before="0" w:line="276" w:lineRule="auto"/>
+      </w:pPr>
       <w:r>
         <w:rPr>
           <w:rFonts w:ascii="Calibri" w:hAnsi="Calibri" w:eastAsia="Calibri"/>
@@ -134,18 +268,23 @@
     </w:p>
     <w:p>
       <w:pPr>
-        <w:spacing w:after="160" w:before="0" w:line="276" w:lineRule="auto"/>
+        <w:pStyle w:val="Heading2"/>
+        <w:spacing w:before="200" w:after="160"/>
       </w:pPr>
       <w:r>
         <w:rPr>
-          <w:rFonts w:ascii="Calibri" w:hAnsi="Calibri" w:eastAsia="Calibri"/>
+          <w:rFonts w:ascii="Georgia" w:hAnsi="Georgia"/>
           <w:b/>
-          <w:i w:val="0"/>
-          <w:color w:val="171310"/>
-          <w:sz w:val="22"/>
+          <w:color w:val="C43C28"/>
+          <w:sz w:val="26"/>
         </w:rPr>
-        <w:t xml:space="preserve">À qui ce problème se pose-t-il ? </w:t>
+        <w:t>À qui ce problème se pose-t-il ?</w:t>
       </w:r>
+    </w:p>
+    <w:p>
+      <w:pPr>
+        <w:spacing w:after="160" w:before="0" w:line="276" w:lineRule="auto"/>
+      </w:pPr>
       <w:r>
         <w:rPr>
           <w:rFonts w:ascii="Calibri" w:hAnsi="Calibri" w:eastAsia="Calibri"/>
@@ -159,18 +298,23 @@
     </w:p>
     <w:p>
       <w:pPr>
-        <w:spacing w:after="160" w:before="0" w:line="276" w:lineRule="auto"/>
+        <w:pStyle w:val="Heading2"/>
+        <w:spacing w:before="200" w:after="160"/>
       </w:pPr>
       <w:r>
         <w:rPr>
-          <w:rFonts w:ascii="Calibri" w:hAnsi="Calibri" w:eastAsia="Calibri"/>
+          <w:rFonts w:ascii="Georgia" w:hAnsi="Georgia"/>
           <w:b/>
-          <w:i w:val="0"/>
-          <w:color w:val="171310"/>
-          <w:sz w:val="22"/>
+          <w:color w:val="C43C28"/>
+          <w:sz w:val="26"/>
         </w:rPr>
-        <w:t xml:space="preserve">Pourquoi ce problème mérite-t-il une solution ? </w:t>
+        <w:t>Pourquoi ce problème mérite-t-il une solution ?</w:t>
       </w:r>
+    </w:p>
+    <w:p>
+      <w:pPr>
+        <w:spacing w:after="160" w:before="0" w:line="276" w:lineRule="auto"/>
+      </w:pPr>
       <w:r>
         <w:rPr>
           <w:rFonts w:ascii="Calibri" w:hAnsi="Calibri" w:eastAsia="Calibri"/>
@@ -184,13 +328,13 @@
     </w:p>
     <w:p>
       <w:pPr>
-        <w:spacing w:after="160" w:before="320" w:line="276" w:lineRule="auto"/>
+        <w:pStyle w:val="Heading1"/>
+        <w:spacing w:before="320" w:after="160"/>
       </w:pPr>
       <w:r>
         <w:rPr>
-          <w:rFonts w:ascii="Georgia" w:hAnsi="Georgia" w:eastAsia="Georgia"/>
+          <w:rFonts w:ascii="Georgia" w:hAnsi="Georgia"/>
           <w:b/>
-          <w:i w:val="0"/>
           <w:color w:val="C43C28"/>
           <w:sz w:val="36"/>
         </w:rPr>
@@ -239,15 +383,15 @@
     </w:p>
     <w:p>
       <w:pPr>
-        <w:spacing w:after="80" w:before="0" w:line="276" w:lineRule="auto"/>
+        <w:pStyle w:val="Heading2"/>
+        <w:spacing w:before="200" w:after="160"/>
       </w:pPr>
       <w:r>
         <w:rPr>
-          <w:rFonts w:ascii="Calibri" w:hAnsi="Calibri" w:eastAsia="Calibri"/>
+          <w:rFonts w:ascii="Georgia" w:hAnsi="Georgia"/>
           <w:b/>
-          <w:i w:val="0"/>
-          <w:color w:val="171310"/>
-          <w:sz w:val="24"/>
+          <w:color w:val="C43C28"/>
+          <w:sz w:val="26"/>
         </w:rPr>
         <w:t>Avantages</w:t>
       </w:r>
@@ -384,13 +528,13 @@
     </w:p>
     <w:p>
       <w:pPr>
-        <w:spacing w:after="160" w:before="320" w:line="276" w:lineRule="auto"/>
+        <w:pStyle w:val="Heading1"/>
+        <w:spacing w:before="320" w:after="160"/>
       </w:pPr>
       <w:r>
         <w:rPr>
-          <w:rFonts w:ascii="Georgia" w:hAnsi="Georgia" w:eastAsia="Georgia"/>
+          <w:rFonts w:ascii="Georgia" w:hAnsi="Georgia"/>
           <w:b/>
-          <w:i w:val="0"/>
           <w:color w:val="C43C28"/>
           <w:sz w:val="36"/>
         </w:rPr>
@@ -529,13 +673,13 @@
     </w:p>
     <w:p>
       <w:pPr>
-        <w:spacing w:after="160" w:before="320" w:line="276" w:lineRule="auto"/>
+        <w:pStyle w:val="Heading1"/>
+        <w:spacing w:before="320" w:after="160"/>
       </w:pPr>
       <w:r>
         <w:rPr>
-          <w:rFonts w:ascii="Georgia" w:hAnsi="Georgia" w:eastAsia="Georgia"/>
+          <w:rFonts w:ascii="Georgia" w:hAnsi="Georgia"/>
           <w:b/>
-          <w:i w:val="0"/>
           <w:color w:val="C43C28"/>
           <w:sz w:val="36"/>
         </w:rPr>
@@ -629,13 +773,13 @@
     </w:p>
     <w:p>
       <w:pPr>
-        <w:spacing w:after="160" w:before="320" w:line="276" w:lineRule="auto"/>
+        <w:pStyle w:val="Heading1"/>
+        <w:spacing w:before="320" w:after="160"/>
       </w:pPr>
       <w:r>
         <w:rPr>
-          <w:rFonts w:ascii="Georgia" w:hAnsi="Georgia" w:eastAsia="Georgia"/>
+          <w:rFonts w:ascii="Georgia" w:hAnsi="Georgia"/>
           <w:b/>
-          <w:i w:val="0"/>
           <w:color w:val="C43C28"/>
           <w:sz w:val="36"/>
         </w:rPr>
@@ -995,13 +1139,13 @@
     </w:p>
     <w:p>
       <w:pPr>
-        <w:spacing w:after="160" w:before="320" w:line="276" w:lineRule="auto"/>
+        <w:pStyle w:val="Heading1"/>
+        <w:spacing w:before="320" w:after="160"/>
       </w:pPr>
       <w:r>
         <w:rPr>
-          <w:rFonts w:ascii="Georgia" w:hAnsi="Georgia" w:eastAsia="Georgia"/>
+          <w:rFonts w:ascii="Georgia" w:hAnsi="Georgia"/>
           <w:b/>
-          <w:i w:val="0"/>
           <w:color w:val="C43C28"/>
           <w:sz w:val="36"/>
         </w:rPr>
@@ -1536,11 +1680,11 @@
       <w:outlineLvl w:val="0"/>
     </w:pPr>
     <w:rPr>
-      <w:rFonts w:asciiTheme="majorHAnsi" w:eastAsiaTheme="majorEastAsia" w:hAnsiTheme="majorHAnsi" w:cstheme="majorBidi"/>
+      <w:rFonts w:asciiTheme="majorHAnsi" w:eastAsiaTheme="majorEastAsia" w:hAnsiTheme="majorHAnsi" w:cstheme="majorBidi" w:ascii="Georgia" w:hAnsi="Georgia"/>
       <w:b/>
       <w:bCs/>
-      <w:color w:val="365F91" w:themeColor="accent1" w:themeShade="BF"/>
-      <w:sz w:val="28"/>
+      <w:color w:val="C43C28"/>
+      <w:sz w:val="36"/>
       <w:szCs w:val="28"/>
     </w:rPr>
   </w:style>
@@ -1560,10 +1704,10 @@
       <w:outlineLvl w:val="1"/>
     </w:pPr>
     <w:rPr>
-      <w:rFonts w:asciiTheme="majorHAnsi" w:eastAsiaTheme="majorEastAsia" w:hAnsiTheme="majorHAnsi" w:cstheme="majorBidi"/>
+      <w:rFonts w:asciiTheme="majorHAnsi" w:eastAsiaTheme="majorEastAsia" w:hAnsiTheme="majorHAnsi" w:cstheme="majorBidi" w:ascii="Georgia" w:hAnsi="Georgia"/>
       <w:b/>
       <w:bCs/>
-      <w:color w:val="4F81BD" w:themeColor="accent1"/>
+      <w:color w:val="C43C28"/>
       <w:sz w:val="26"/>
       <w:szCs w:val="26"/>
     </w:rPr>

</xml_diff>

<commit_message>
Add GitHub repository link to deliverables.
Co-authored-by: Cursor <cursoragent@cursor.com>
</commit_message>
<xml_diff>
--- a/livrables/document-explicatif.docx
+++ b/livrables/document-explicatif.docx
@@ -1181,7 +1181,7 @@
           <w:color w:val="171310"/>
           <w:sz w:val="22"/>
         </w:rPr>
-        <w:t>Présentation PowerPoint : livrables/Recup-presentation.pptx</w:t>
+        <w:t>Présentation PowerPoint : livrables/Recup-presentation-EQUIPE_7.pptx</w:t>
       </w:r>
     </w:p>
     <w:p>
@@ -1213,7 +1213,7 @@
           <w:color w:val="171310"/>
           <w:sz w:val="22"/>
         </w:rPr>
-        <w:t>Lien de démonstration en ligne : à coller ici si vous hébergez le proto (GitHub Pages, Netlify…)</w:t>
+        <w:t>Dépôt GitHub : https://github.com/lightbakpassim/recup-equipe-7</w:t>
       </w:r>
     </w:p>
     <w:p>
@@ -1229,7 +1229,7 @@
           <w:color w:val="171310"/>
           <w:sz w:val="22"/>
         </w:rPr>
-        <w:t>Dépôt GitHub : à coller ici si disponible</w:t>
+        <w:t>Démo Netlify : à coller après le déploiement (Import from Git → ce dépôt)</w:t>
       </w:r>
     </w:p>
     <w:p>

</xml_diff>